<commit_message>
hoan thanh table han muc van con loi mo file
</commit_message>
<xml_diff>
--- a/src/main/resources/templates/PhuongAnVayVon.docx
+++ b/src/main/resources/templates/PhuongAnVayVon.docx
@@ -258,31 +258,31 @@
           <w:rFonts w:ascii="Times New Roman" w:hAnsi="Times New Roman"/>
           <w:sz w:val="28"/>
         </w:rPr>
-        <w:t>: {{cccdkh</w:t>
-      </w:r>
-      <w:r>
-        <w:rPr>
-          <w:rFonts w:ascii="Times New Roman" w:hAnsi="Times New Roman"/>
-          <w:sz w:val="28"/>
-        </w:rPr>
-        <w:t xml:space="preserve">}}; </w:t>
-      </w:r>
-      <w:r>
-        <w:rPr>
-          <w:rFonts w:ascii="Times New Roman" w:hAnsi="Times New Roman"/>
-          <w:sz w:val="28"/>
-        </w:rPr>
-        <w:t>Cấ</w:t>
-      </w:r>
-      <w:r>
-        <w:rPr>
-          <w:rFonts w:ascii="Times New Roman" w:hAnsi="Times New Roman"/>
-          <w:sz w:val="28"/>
-        </w:rPr>
-        <w:t xml:space="preserve">p ngày: {{nckh}}; </w:t>
+        <w:t>: {{cccdkh}}</w:t>
       </w:r>
       <w:bookmarkStart w:id="0" w:name="_GoBack"/>
       <w:bookmarkEnd w:id="0"/>
+      <w:r>
+        <w:rPr>
+          <w:rFonts w:ascii="Times New Roman" w:hAnsi="Times New Roman"/>
+          <w:sz w:val="28"/>
+        </w:rPr>
+        <w:t xml:space="preserve">; </w:t>
+      </w:r>
+      <w:r>
+        <w:rPr>
+          <w:rFonts w:ascii="Times New Roman" w:hAnsi="Times New Roman"/>
+          <w:sz w:val="28"/>
+        </w:rPr>
+        <w:t>Cấ</w:t>
+      </w:r>
+      <w:r>
+        <w:rPr>
+          <w:rFonts w:ascii="Times New Roman" w:hAnsi="Times New Roman"/>
+          <w:sz w:val="28"/>
+        </w:rPr>
+        <w:t xml:space="preserve">p ngày: {{nckh}}; </w:t>
+      </w:r>
       <w:r>
         <w:rPr>
           <w:rFonts w:ascii="Times New Roman" w:hAnsi="Times New Roman"/>

</xml_diff>

<commit_message>
hoan thanh merge cot
</commit_message>
<xml_diff>
--- a/src/main/resources/templates/PhuongAnVayVon.docx
+++ b/src/main/resources/templates/PhuongAnVayVon.docx
@@ -109,12 +109,14 @@
         <w:jc w:val="center"/>
         <w:rPr>
           <w:rFonts w:ascii="Times New Roman" w:hAnsi="Times New Roman"/>
-          <w:sz w:val="28"/>
-        </w:rPr>
-      </w:pPr>
-      <w:r>
-        <w:rPr>
-          <w:rFonts w:ascii="Times New Roman" w:hAnsi="Times New Roman"/>
+          <w:b/>
+          <w:sz w:val="28"/>
+        </w:rPr>
+      </w:pPr>
+      <w:r>
+        <w:rPr>
+          <w:rFonts w:ascii="Times New Roman" w:hAnsi="Times New Roman"/>
+          <w:b/>
           <w:sz w:val="28"/>
         </w:rPr>
         <w:t>PHƯƠNG ÁN VAY VỐN</w:t>
@@ -124,31 +126,62 @@
       <w:pPr>
         <w:rPr>
           <w:rFonts w:ascii="Times New Roman" w:hAnsi="Times New Roman"/>
-          <w:b/>
-          <w:sz w:val="28"/>
-        </w:rPr>
-      </w:pPr>
-      <w:r>
-        <w:rPr>
-          <w:rFonts w:ascii="Times New Roman" w:hAnsi="Times New Roman"/>
-          <w:b/>
-          <w:sz w:val="28"/>
-        </w:rPr>
-        <w:t>Kính gửi: QUỸ TÍN DỤNG THÁI HỌC</w:t>
-      </w:r>
-    </w:p>
-    <w:p>
-      <w:pPr>
-        <w:rPr>
-          <w:rFonts w:ascii="Times New Roman" w:hAnsi="Times New Roman"/>
-          <w:b/>
-          <w:sz w:val="28"/>
-        </w:rPr>
-      </w:pPr>
-      <w:r>
-        <w:rPr>
-          <w:rFonts w:ascii="Times New Roman" w:hAnsi="Times New Roman"/>
-          <w:b/>
+          <w:sz w:val="28"/>
+        </w:rPr>
+      </w:pPr>
+      <w:r>
+        <w:rPr>
+          <w:rFonts w:ascii="Times New Roman" w:hAnsi="Times New Roman"/>
+          <w:sz w:val="28"/>
+        </w:rPr>
+        <w:t xml:space="preserve">Kính gửi: </w:t>
+      </w:r>
+      <w:r>
+        <w:rPr>
+          <w:rFonts w:ascii="Times New Roman" w:hAnsi="Times New Roman"/>
+          <w:sz w:val="28"/>
+        </w:rPr>
+        <w:tab/>
+      </w:r>
+      <w:r>
+        <w:rPr>
+          <w:rFonts w:ascii="Times New Roman" w:hAnsi="Times New Roman"/>
+          <w:sz w:val="28"/>
+        </w:rPr>
+        <w:tab/>
+      </w:r>
+      <w:r>
+        <w:rPr>
+          <w:rFonts w:ascii="Times New Roman" w:hAnsi="Times New Roman"/>
+          <w:sz w:val="28"/>
+        </w:rPr>
+        <w:t xml:space="preserve">QUỸ TÍN DỤNG </w:t>
+      </w:r>
+      <w:r>
+        <w:rPr>
+          <w:rFonts w:ascii="Times New Roman" w:hAnsi="Times New Roman"/>
+          <w:sz w:val="28"/>
+        </w:rPr>
+        <w:t xml:space="preserve">NHÂN DÂN </w:t>
+      </w:r>
+      <w:r>
+        <w:rPr>
+          <w:rFonts w:ascii="Times New Roman" w:hAnsi="Times New Roman"/>
+          <w:sz w:val="28"/>
+        </w:rPr>
+        <w:t>THÁI HỌC</w:t>
+      </w:r>
+    </w:p>
+    <w:p>
+      <w:pPr>
+        <w:rPr>
+          <w:rFonts w:ascii="Times New Roman" w:hAnsi="Times New Roman"/>
+          <w:sz w:val="28"/>
+        </w:rPr>
+      </w:pPr>
+      <w:r>
+        <w:rPr>
+          <w:rFonts w:ascii="Times New Roman" w:hAnsi="Times New Roman"/>
           <w:sz w:val="28"/>
         </w:rPr>
         <w:t>1.</w:t>
@@ -156,10 +189,23 @@
       <w:r>
         <w:rPr>
           <w:rFonts w:ascii="Times New Roman" w:hAnsi="Times New Roman"/>
-          <w:b/>
-          <w:sz w:val="28"/>
-        </w:rPr>
-        <w:t xml:space="preserve"> Người lập phương án:</w:t>
+          <w:sz w:val="28"/>
+        </w:rPr>
+        <w:t xml:space="preserve"> KHÁCH HÀNG VAY VỐN </w:t>
+      </w:r>
+      <w:r>
+        <w:rPr>
+          <w:rFonts w:ascii="Times New Roman" w:hAnsi="Times New Roman"/>
+          <w:sz w:val="28"/>
+        </w:rPr>
+        <w:t>:</w:t>
+      </w:r>
+      <w:r>
+        <w:rPr>
+          <w:rFonts w:ascii="Times New Roman" w:hAnsi="Times New Roman"/>
+          <w:sz w:val="28"/>
+        </w:rPr>
+        <w:t xml:space="preserve">               Điện thoại liên hệ: {{sdtkh}}</w:t>
       </w:r>
     </w:p>
     <w:p>
@@ -186,6 +232,13 @@
       <w:r>
         <w:rPr>
           <w:rFonts w:ascii="Times New Roman" w:hAnsi="Times New Roman"/>
+          <w:sz w:val="28"/>
+        </w:rPr>
+        <w:t xml:space="preserve">        </w:t>
+      </w:r>
+      <w:r>
+        <w:rPr>
+          <w:rFonts w:ascii="Times New Roman" w:hAnsi="Times New Roman"/>
           <w:b/>
           <w:sz w:val="28"/>
         </w:rPr>
@@ -196,7 +249,21 @@
           <w:rFonts w:ascii="Times New Roman" w:hAnsi="Times New Roman"/>
           <w:sz w:val="28"/>
         </w:rPr>
-        <w:t xml:space="preserve">       Năm</w:t>
+        <w:t xml:space="preserve">       </w:t>
+      </w:r>
+      <w:r>
+        <w:rPr>
+          <w:rFonts w:ascii="Times New Roman" w:hAnsi="Times New Roman"/>
+          <w:sz w:val="28"/>
+        </w:rPr>
+        <w:t xml:space="preserve">              </w:t>
+      </w:r>
+      <w:r>
+        <w:rPr>
+          <w:rFonts w:ascii="Times New Roman" w:hAnsi="Times New Roman"/>
+          <w:sz w:val="28"/>
+        </w:rPr>
+        <w:t>Năm</w:t>
       </w:r>
       <w:r>
         <w:rPr>
@@ -251,7 +318,7 @@
           <w:sz w:val="28"/>
         </w:rPr>
         <w:tab/>
-        <w:t>CC/CCCD số</w:t>
+        <w:t>CCCD số</w:t>
       </w:r>
       <w:r>
         <w:rPr>
@@ -260,8 +327,6 @@
         </w:rPr>
         <w:t>: {{cccdkh}}</w:t>
       </w:r>
-      <w:bookmarkStart w:id="0" w:name="_GoBack"/>
-      <w:bookmarkEnd w:id="0"/>
       <w:r>
         <w:rPr>
           <w:rFonts w:ascii="Times New Roman" w:hAnsi="Times New Roman"/>
@@ -295,14 +360,12 @@
       <w:pPr>
         <w:rPr>
           <w:rFonts w:ascii="Times New Roman" w:hAnsi="Times New Roman"/>
-          <w:b/>
-          <w:sz w:val="28"/>
-        </w:rPr>
-      </w:pPr>
-      <w:r>
-        <w:rPr>
-          <w:rFonts w:ascii="Times New Roman" w:hAnsi="Times New Roman"/>
-          <w:b/>
+          <w:sz w:val="28"/>
+        </w:rPr>
+      </w:pPr>
+      <w:r>
+        <w:rPr>
+          <w:rFonts w:ascii="Times New Roman" w:hAnsi="Times New Roman"/>
           <w:sz w:val="28"/>
         </w:rPr>
         <w:t>2.</w:t>
@@ -310,7 +373,6 @@
       <w:r>
         <w:rPr>
           <w:rFonts w:ascii="Times New Roman" w:hAnsi="Times New Roman"/>
-          <w:b/>
           <w:sz w:val="28"/>
         </w:rPr>
         <w:t xml:space="preserve"> Giấy CNĐKKD số: </w:t>
@@ -318,51 +380,71 @@
       <w:r>
         <w:rPr>
           <w:rFonts w:ascii="Times New Roman" w:hAnsi="Times New Roman"/>
-          <w:b/>
-          <w:sz w:val="28"/>
-        </w:rPr>
-        <w:tab/>
-      </w:r>
-      <w:r>
-        <w:rPr>
-          <w:rFonts w:ascii="Times New Roman" w:hAnsi="Times New Roman"/>
-          <w:b/>
-          <w:sz w:val="28"/>
-        </w:rPr>
-        <w:tab/>
-        <w:t xml:space="preserve">Nơi cấp: </w:t>
-      </w:r>
-      <w:r>
-        <w:rPr>
-          <w:rFonts w:ascii="Times New Roman" w:hAnsi="Times New Roman"/>
-          <w:b/>
-          <w:sz w:val="28"/>
-        </w:rPr>
-        <w:tab/>
-      </w:r>
-      <w:r>
-        <w:rPr>
-          <w:rFonts w:ascii="Times New Roman" w:hAnsi="Times New Roman"/>
-          <w:b/>
-          <w:sz w:val="28"/>
-        </w:rPr>
-        <w:tab/>
-      </w:r>
-      <w:r>
-        <w:rPr>
-          <w:rFonts w:ascii="Times New Roman" w:hAnsi="Times New Roman"/>
-          <w:b/>
-          <w:sz w:val="28"/>
-        </w:rPr>
-        <w:tab/>
-      </w:r>
-      <w:r>
-        <w:rPr>
-          <w:rFonts w:ascii="Times New Roman" w:hAnsi="Times New Roman"/>
-          <w:b/>
-          <w:sz w:val="28"/>
-        </w:rPr>
-        <w:tab/>
+          <w:sz w:val="28"/>
+        </w:rPr>
+        <w:tab/>
+      </w:r>
+      <w:r>
+        <w:rPr>
+          <w:rFonts w:ascii="Times New Roman" w:hAnsi="Times New Roman"/>
+          <w:sz w:val="28"/>
+        </w:rPr>
+        <w:tab/>
+      </w:r>
+      <w:r>
+        <w:rPr>
+          <w:rFonts w:ascii="Times New Roman" w:hAnsi="Times New Roman"/>
+          <w:sz w:val="28"/>
+        </w:rPr>
+        <w:t xml:space="preserve">   </w:t>
+      </w:r>
+      <w:r>
+        <w:rPr>
+          <w:rFonts w:ascii="Times New Roman" w:hAnsi="Times New Roman"/>
+          <w:sz w:val="28"/>
+        </w:rPr>
+        <w:t>Nơi cấ</w:t>
+      </w:r>
+      <w:r>
+        <w:rPr>
+          <w:rFonts w:ascii="Times New Roman" w:hAnsi="Times New Roman"/>
+          <w:sz w:val="28"/>
+        </w:rPr>
+        <w:t xml:space="preserve">p: </w:t>
+      </w:r>
+      <w:r>
+        <w:rPr>
+          <w:rFonts w:ascii="Times New Roman" w:hAnsi="Times New Roman"/>
+          <w:sz w:val="28"/>
+        </w:rPr>
+        <w:tab/>
+      </w:r>
+      <w:r>
+        <w:rPr>
+          <w:rFonts w:ascii="Times New Roman" w:hAnsi="Times New Roman"/>
+          <w:sz w:val="28"/>
+        </w:rPr>
+        <w:tab/>
+      </w:r>
+      <w:r>
+        <w:rPr>
+          <w:rFonts w:ascii="Times New Roman" w:hAnsi="Times New Roman"/>
+          <w:sz w:val="28"/>
+        </w:rPr>
+        <w:tab/>
+      </w:r>
+      <w:r>
+        <w:rPr>
+          <w:rFonts w:ascii="Times New Roman" w:hAnsi="Times New Roman"/>
+          <w:sz w:val="28"/>
+        </w:rPr>
+        <w:t xml:space="preserve"> </w:t>
+      </w:r>
+      <w:r>
+        <w:rPr>
+          <w:rFonts w:ascii="Times New Roman" w:hAnsi="Times New Roman"/>
+          <w:sz w:val="28"/>
+        </w:rPr>
         <w:t>Cấp ngày:</w:t>
       </w:r>
     </w:p>
@@ -370,14 +452,12 @@
       <w:pPr>
         <w:rPr>
           <w:rFonts w:ascii="Times New Roman" w:hAnsi="Times New Roman"/>
-          <w:b/>
-          <w:sz w:val="28"/>
-        </w:rPr>
-      </w:pPr>
-      <w:r>
-        <w:rPr>
-          <w:rFonts w:ascii="Times New Roman" w:hAnsi="Times New Roman"/>
-          <w:b/>
+          <w:sz w:val="28"/>
+        </w:rPr>
+      </w:pPr>
+      <w:r>
+        <w:rPr>
+          <w:rFonts w:ascii="Times New Roman" w:hAnsi="Times New Roman"/>
           <w:sz w:val="28"/>
         </w:rPr>
         <w:t>3.</w:t>
@@ -385,7 +465,6 @@
       <w:r>
         <w:rPr>
           <w:rFonts w:ascii="Times New Roman" w:hAnsi="Times New Roman"/>
-          <w:b/>
           <w:sz w:val="28"/>
         </w:rPr>
         <w:t xml:space="preserve"> Đề nghị quỹ tín dụng nhân dân Thái Học xét duyệt cho tôi được vay vốn để thực hiện phương án kinh doanh của gia đình tôi</w:t>
@@ -407,6 +486,23 @@
           <w:sz w:val="28"/>
         </w:rPr>
         <w:t>NỘI DUNG PHƯƠNG ÁN</w:t>
+      </w:r>
+    </w:p>
+    <w:p>
+      <w:pPr>
+        <w:rPr>
+          <w:rFonts w:ascii="Times New Roman" w:hAnsi="Times New Roman"/>
+          <w:b/>
+          <w:sz w:val="28"/>
+        </w:rPr>
+      </w:pPr>
+      <w:r>
+        <w:rPr>
+          <w:rFonts w:ascii="Times New Roman" w:hAnsi="Times New Roman"/>
+          <w:b/>
+          <w:sz w:val="28"/>
+        </w:rPr>
+        <w:t>1. Giới thiệu phương án</w:t>
       </w:r>
     </w:p>
     <w:p>
@@ -475,7 +571,7 @@
           <w:rFonts w:ascii="Times New Roman" w:hAnsi="Times New Roman"/>
           <w:sz w:val="28"/>
         </w:rPr>
-        <w:t>{{tghm}}</w:t>
+        <w:t>{{hm1}}</w:t>
       </w:r>
     </w:p>
     <w:p>
@@ -491,6 +587,40 @@
           <w:rFonts w:ascii="Times New Roman" w:hAnsi="Times New Roman"/>
           <w:sz w:val="28"/>
         </w:rPr>
+        <w:t>{{hm2}}</w:t>
+      </w:r>
+    </w:p>
+    <w:p>
+      <w:pPr>
+        <w:ind w:left="360"/>
+        <w:rPr>
+          <w:rFonts w:ascii="Times New Roman" w:hAnsi="Times New Roman"/>
+          <w:b/>
+          <w:sz w:val="28"/>
+        </w:rPr>
+      </w:pPr>
+      <w:r>
+        <w:rPr>
+          <w:rFonts w:ascii="Times New Roman" w:hAnsi="Times New Roman"/>
+          <w:b/>
+          <w:sz w:val="28"/>
+        </w:rPr>
+        <w:t>{{hm3}}</w:t>
+      </w:r>
+    </w:p>
+    <w:p>
+      <w:pPr>
+        <w:ind w:left="360"/>
+        <w:rPr>
+          <w:rFonts w:ascii="Times New Roman" w:hAnsi="Times New Roman"/>
+          <w:sz w:val="28"/>
+        </w:rPr>
+      </w:pPr>
+      <w:r>
+        <w:rPr>
+          <w:rFonts w:ascii="Times New Roman" w:hAnsi="Times New Roman"/>
+          <w:sz w:val="28"/>
+        </w:rPr>
         <w:t>{{TABLE_HM_PLACEHO</w:t>
       </w:r>
       <w:r>
@@ -518,49 +648,96 @@
       <w:r>
         <w:rPr>
           <w:rFonts w:ascii="Times New Roman" w:hAnsi="Times New Roman"/>
-          <w:sz w:val="28"/>
-        </w:rPr>
-        <w:t xml:space="preserve">            {{vqhm}}</w:t>
-      </w:r>
-    </w:p>
-    <w:p>
-      <w:pPr>
-        <w:rPr>
-          <w:rFonts w:ascii="Times New Roman" w:hAnsi="Times New Roman"/>
-          <w:sz w:val="28"/>
-        </w:rPr>
-      </w:pPr>
-      <w:r>
-        <w:rPr>
-          <w:rFonts w:ascii="Times New Roman" w:hAnsi="Times New Roman"/>
-          <w:b/>
-          <w:sz w:val="28"/>
-        </w:rPr>
-        <w:t xml:space="preserve">      </w:t>
-      </w:r>
-      <w:r>
-        <w:rPr>
-          <w:rFonts w:ascii="Times New Roman" w:hAnsi="Times New Roman"/>
-          <w:sz w:val="28"/>
-        </w:rPr>
-        <w:t>{{tgvv}}</w:t>
-      </w:r>
-    </w:p>
-    <w:p>
-      <w:pPr>
-        <w:rPr>
-          <w:rFonts w:ascii="Times New Roman" w:hAnsi="Times New Roman"/>
-          <w:b/>
-          <w:sz w:val="28"/>
-        </w:rPr>
-      </w:pPr>
-      <w:r>
-        <w:rPr>
-          <w:rFonts w:ascii="Times New Roman" w:hAnsi="Times New Roman"/>
-          <w:b/>
-          <w:sz w:val="28"/>
-        </w:rPr>
-        <w:t>4. Chi phí đầu tư cho phương án:</w:t>
+          <w:b/>
+          <w:sz w:val="28"/>
+        </w:rPr>
+        <w:t>2. Thời gian {{tgpa}}:</w:t>
+      </w:r>
+      <w:r>
+        <w:rPr>
+          <w:rFonts w:ascii="Times New Roman" w:hAnsi="Times New Roman"/>
+          <w:b/>
+          <w:sz w:val="28"/>
+        </w:rPr>
+        <w:t xml:space="preserve"> </w:t>
+      </w:r>
+      <w:r>
+        <w:rPr>
+          <w:rFonts w:ascii="Times New Roman" w:hAnsi="Times New Roman"/>
+          <w:sz w:val="28"/>
+        </w:rPr>
+        <w:t xml:space="preserve">          {{tgvv}}</w:t>
+      </w:r>
+    </w:p>
+    <w:p>
+      <w:pPr>
+        <w:rPr>
+          <w:rFonts w:ascii="Times New Roman" w:hAnsi="Times New Roman"/>
+          <w:b/>
+          <w:sz w:val="28"/>
+        </w:rPr>
+      </w:pPr>
+      <w:r>
+        <w:rPr>
+          <w:rFonts w:ascii="Times New Roman" w:hAnsi="Times New Roman"/>
+          <w:b/>
+          <w:sz w:val="28"/>
+        </w:rPr>
+        <w:t>3.</w:t>
+      </w:r>
+      <w:r>
+        <w:rPr>
+          <w:rFonts w:ascii="Times New Roman" w:hAnsi="Times New Roman"/>
+          <w:b/>
+          <w:sz w:val="28"/>
+        </w:rPr>
+        <w:t xml:space="preserve"> Tình hình tài chính của phương án:</w:t>
+      </w:r>
+    </w:p>
+    <w:p>
+      <w:pPr>
+        <w:rPr>
+          <w:rFonts w:ascii="Times New Roman" w:hAnsi="Times New Roman"/>
+          <w:sz w:val="28"/>
+        </w:rPr>
+      </w:pPr>
+      <w:r>
+        <w:rPr>
+          <w:rFonts w:ascii="Times New Roman" w:hAnsi="Times New Roman"/>
+          <w:sz w:val="28"/>
+        </w:rPr>
+        <w:lastRenderedPageBreak/>
+        <w:t>3</w:t>
+      </w:r>
+      <w:r>
+        <w:rPr>
+          <w:rFonts w:ascii="Times New Roman" w:hAnsi="Times New Roman"/>
+          <w:sz w:val="28"/>
+        </w:rPr>
+        <w:t>.</w:t>
+      </w:r>
+      <w:r>
+        <w:rPr>
+          <w:rFonts w:ascii="Times New Roman" w:hAnsi="Times New Roman"/>
+          <w:sz w:val="28"/>
+        </w:rPr>
+        <w:t>1</w:t>
+      </w:r>
+      <w:r>
+        <w:rPr>
+          <w:rFonts w:ascii="Times New Roman" w:hAnsi="Times New Roman"/>
+          <w:sz w:val="28"/>
+        </w:rPr>
+        <w:t xml:space="preserve"> </w:t>
+      </w:r>
+      <w:bookmarkStart w:id="0" w:name="_GoBack"/>
+      <w:bookmarkEnd w:id="0"/>
+      <w:r>
+        <w:rPr>
+          <w:rFonts w:ascii="Times New Roman" w:hAnsi="Times New Roman"/>
+          <w:sz w:val="28"/>
+        </w:rPr>
+        <w:t>Chi phí đầu tư cho phương án:</w:t>
       </w:r>
     </w:p>
     <w:p>
@@ -622,452 +799,452 @@
           <w:rFonts w:ascii="Times New Roman" w:hAnsi="Times New Roman"/>
           <w:sz w:val="28"/>
         </w:rPr>
+        <w:t>- Tổng nhu cầu vốn lưu động của phương án: {{tongVonLu</w:t>
+      </w:r>
+      <w:r>
+        <w:rPr>
+          <w:rFonts w:ascii="Times New Roman" w:hAnsi="Times New Roman"/>
+          <w:sz w:val="28"/>
+        </w:rPr>
+        <w:t>u</w:t>
+      </w:r>
+      <w:r>
+        <w:rPr>
+          <w:rFonts w:ascii="Times New Roman" w:hAnsi="Times New Roman"/>
+          <w:sz w:val="28"/>
+        </w:rPr>
+        <w:t>Dong}}</w:t>
+      </w:r>
+      <w:r>
+        <w:rPr>
+          <w:rFonts w:ascii="Times New Roman" w:hAnsi="Times New Roman"/>
+          <w:sz w:val="28"/>
+        </w:rPr>
+        <w:t xml:space="preserve"> đồng</w:t>
+      </w:r>
+      <w:r>
+        <w:rPr>
+          <w:rFonts w:ascii="Times New Roman" w:hAnsi="Times New Roman"/>
+          <w:sz w:val="28"/>
+        </w:rPr>
+        <w:t>.</w:t>
+      </w:r>
+    </w:p>
+    <w:p>
+      <w:pPr>
+        <w:ind w:left="360"/>
+        <w:rPr>
+          <w:rFonts w:ascii="Times New Roman" w:hAnsi="Times New Roman"/>
+          <w:sz w:val="28"/>
+        </w:rPr>
+      </w:pPr>
+      <w:r>
+        <w:rPr>
+          <w:rFonts w:ascii="Times New Roman" w:hAnsi="Times New Roman"/>
+          <w:sz w:val="28"/>
+        </w:rPr>
+        <w:t>(Vốn lưu động của phương án = Tổng chi phí của phương án – Chi phí gián tiếp).</w:t>
+      </w:r>
+    </w:p>
+    <w:p>
+      <w:pPr>
+        <w:ind w:left="360"/>
+        <w:rPr>
+          <w:rFonts w:ascii="Times New Roman" w:hAnsi="Times New Roman"/>
+          <w:sz w:val="28"/>
+        </w:rPr>
+      </w:pPr>
+      <w:r>
+        <w:rPr>
+          <w:rFonts w:ascii="Times New Roman" w:hAnsi="Times New Roman"/>
+          <w:sz w:val="28"/>
+        </w:rPr>
+        <w:t>{{vongQuay}}</w:t>
+      </w:r>
+    </w:p>
+    <w:p>
+      <w:pPr>
+        <w:ind w:left="360"/>
+        <w:rPr>
+          <w:rFonts w:ascii="Times New Roman" w:hAnsi="Times New Roman"/>
+          <w:sz w:val="28"/>
+        </w:rPr>
+      </w:pPr>
+      <w:r>
+        <w:rPr>
+          <w:rFonts w:ascii="Times New Roman" w:hAnsi="Times New Roman"/>
+          <w:sz w:val="28"/>
+        </w:rPr>
+        <w:t>{{vonLuuDong</w:t>
+      </w:r>
+      <w:r>
+        <w:rPr>
+          <w:rFonts w:ascii="Times New Roman" w:hAnsi="Times New Roman"/>
+          <w:sz w:val="28"/>
+        </w:rPr>
+        <w:t>MotVongQuay}}</w:t>
+      </w:r>
+    </w:p>
+    <w:p>
+      <w:pPr>
+        <w:ind w:left="360"/>
+        <w:rPr>
+          <w:rFonts w:ascii="Times New Roman" w:hAnsi="Times New Roman"/>
+          <w:sz w:val="28"/>
+        </w:rPr>
+      </w:pPr>
+      <w:r>
+        <w:rPr>
+          <w:rFonts w:ascii="Times New Roman" w:hAnsi="Times New Roman"/>
+          <w:sz w:val="28"/>
+        </w:rPr>
+        <w:t>- Vốn tự có lũy kế:               {{vonTuCo}}               {{vonTuCoPercent}}.</w:t>
+      </w:r>
+    </w:p>
+    <w:p>
+      <w:pPr>
+        <w:ind w:left="360"/>
+        <w:rPr>
+          <w:rFonts w:ascii="Times New Roman" w:hAnsi="Times New Roman"/>
+          <w:sz w:val="28"/>
+        </w:rPr>
+      </w:pPr>
+      <w:r>
+        <w:rPr>
+          <w:rFonts w:ascii="Times New Roman" w:hAnsi="Times New Roman"/>
+          <w:sz w:val="28"/>
+        </w:rPr>
+        <w:t>- Vốn khác:                          {{vonKhac}}.               {{vonKhacPercent}}.</w:t>
+      </w:r>
+    </w:p>
+    <w:p>
+      <w:pPr>
+        <w:ind w:left="360"/>
+        <w:rPr>
+          <w:rFonts w:ascii="Times New Roman" w:hAnsi="Times New Roman"/>
+          <w:sz w:val="28"/>
+        </w:rPr>
+      </w:pPr>
+      <w:r>
+        <w:rPr>
+          <w:rFonts w:ascii="Times New Roman" w:hAnsi="Times New Roman"/>
+          <w:sz w:val="28"/>
+        </w:rPr>
+        <w:t>- Vốn vay quỹ tín dụng:       {{tienso}}               {{tienSoPercent}}.</w:t>
+      </w:r>
+    </w:p>
+    <w:p>
+      <w:pPr>
+        <w:rPr>
+          <w:rFonts w:ascii="Times New Roman" w:hAnsi="Times New Roman"/>
+          <w:b/>
+          <w:sz w:val="28"/>
+        </w:rPr>
+      </w:pPr>
+      <w:r>
+        <w:rPr>
+          <w:rFonts w:ascii="Times New Roman" w:hAnsi="Times New Roman"/>
+          <w:b/>
+          <w:sz w:val="28"/>
+        </w:rPr>
+        <w:t xml:space="preserve">8. Tài sản đảm bảo: </w:t>
+      </w:r>
+    </w:p>
+    <w:p>
+      <w:pPr>
+        <w:rPr>
+          <w:rFonts w:ascii="Times New Roman" w:hAnsi="Times New Roman"/>
+          <w:sz w:val="28"/>
+        </w:rPr>
+      </w:pPr>
+      <w:r>
+        <w:rPr>
+          <w:rFonts w:ascii="Times New Roman" w:hAnsi="Times New Roman"/>
+          <w:sz w:val="28"/>
+        </w:rPr>
+        <w:t xml:space="preserve">Giấy chứng nhận Quyền sử dụng đất số: </w:t>
+      </w:r>
+      <w:r>
+        <w:rPr>
+          <w:rFonts w:ascii="Times New Roman" w:hAnsi="Times New Roman"/>
+          <w:sz w:val="28"/>
+        </w:rPr>
+        <w:tab/>
+      </w:r>
+      <w:r>
+        <w:rPr>
+          <w:rFonts w:ascii="Times New Roman" w:hAnsi="Times New Roman"/>
+          <w:sz w:val="28"/>
+        </w:rPr>
+        <w:tab/>
+        <w:t>{{seri}}.</w:t>
+      </w:r>
+    </w:p>
+    <w:p>
+      <w:pPr>
+        <w:rPr>
+          <w:rFonts w:ascii="Times New Roman" w:hAnsi="Times New Roman"/>
+          <w:sz w:val="28"/>
+        </w:rPr>
+      </w:pPr>
+      <w:r>
+        <w:rPr>
+          <w:rFonts w:ascii="Times New Roman" w:hAnsi="Times New Roman"/>
+          <w:sz w:val="28"/>
+        </w:rPr>
+        <w:t xml:space="preserve">Mang tên: </w:t>
+      </w:r>
+      <w:r>
+        <w:rPr>
+          <w:rFonts w:ascii="Times New Roman" w:hAnsi="Times New Roman"/>
+          <w:sz w:val="28"/>
+        </w:rPr>
+        <w:t>{{ndtbd}}.</w:t>
+      </w:r>
+    </w:p>
+    <w:p>
+      <w:pPr>
+        <w:rPr>
+          <w:rFonts w:ascii="Times New Roman" w:hAnsi="Times New Roman"/>
+          <w:sz w:val="28"/>
+        </w:rPr>
+      </w:pPr>
+      <w:r>
+        <w:rPr>
+          <w:rFonts w:ascii="Times New Roman" w:hAnsi="Times New Roman"/>
+          <w:sz w:val="28"/>
+        </w:rPr>
+        <w:t>Số thử</w:t>
+      </w:r>
+      <w:r>
+        <w:rPr>
+          <w:rFonts w:ascii="Times New Roman" w:hAnsi="Times New Roman"/>
+          <w:sz w:val="28"/>
+        </w:rPr>
+        <w:t xml:space="preserve">a: {{std}}.                                        </w:t>
+      </w:r>
+      <w:r>
+        <w:rPr>
+          <w:rFonts w:ascii="Times New Roman" w:hAnsi="Times New Roman"/>
+          <w:sz w:val="28"/>
+        </w:rPr>
+        <w:t>Tờ bản đồ: {{sbd}}.</w:t>
+      </w:r>
+    </w:p>
+    <w:p>
+      <w:pPr>
+        <w:rPr>
+          <w:rFonts w:ascii="Times New Roman" w:hAnsi="Times New Roman"/>
+          <w:sz w:val="28"/>
+        </w:rPr>
+      </w:pPr>
+      <w:r>
+        <w:rPr>
+          <w:rFonts w:ascii="Times New Roman" w:hAnsi="Times New Roman"/>
+          <w:sz w:val="28"/>
+        </w:rPr>
+        <w:t>Vào sổ cấp Giấy chứng nhận số: {{vsmt}}.</w:t>
+      </w:r>
+    </w:p>
+    <w:p>
+      <w:pPr>
+        <w:rPr>
+          <w:rFonts w:ascii="Times New Roman" w:hAnsi="Times New Roman"/>
+          <w:sz w:val="28"/>
+        </w:rPr>
+      </w:pPr>
+      <w:r>
+        <w:rPr>
+          <w:rFonts w:ascii="Times New Roman" w:hAnsi="Times New Roman"/>
+          <w:sz w:val="28"/>
+        </w:rPr>
+        <w:t xml:space="preserve">Do: </w:t>
+      </w:r>
+      <w:r>
+        <w:rPr>
+          <w:rFonts w:ascii="Times New Roman" w:hAnsi="Times New Roman"/>
+          <w:sz w:val="28"/>
+        </w:rPr>
+        <w:t xml:space="preserve">{{dctd}} </w:t>
+      </w:r>
+      <w:r>
+        <w:rPr>
+          <w:rFonts w:ascii="Times New Roman" w:hAnsi="Times New Roman"/>
+          <w:sz w:val="28"/>
+        </w:rPr>
+        <w:t xml:space="preserve">            </w:t>
+      </w:r>
+      <w:r>
+        <w:rPr>
+          <w:rFonts w:ascii="Times New Roman" w:hAnsi="Times New Roman"/>
+          <w:sz w:val="28"/>
+        </w:rPr>
+        <w:t>cấp ngày: {{ngc}}.</w:t>
+      </w:r>
+    </w:p>
+    <w:p>
+      <w:pPr>
+        <w:rPr>
+          <w:rFonts w:ascii="Times New Roman" w:hAnsi="Times New Roman"/>
+          <w:sz w:val="28"/>
+        </w:rPr>
+      </w:pPr>
+      <w:r>
+        <w:rPr>
+          <w:rFonts w:ascii="Times New Roman" w:hAnsi="Times New Roman"/>
+          <w:sz w:val="28"/>
+        </w:rPr>
+        <w:t>Diện tích: {{dt}}.</w:t>
+      </w:r>
+    </w:p>
+    <w:p>
+      <w:pPr>
+        <w:rPr>
+          <w:rFonts w:ascii="Times New Roman" w:hAnsi="Times New Roman"/>
+          <w:b/>
+          <w:i/>
+          <w:sz w:val="28"/>
+        </w:rPr>
+      </w:pPr>
+      <w:r>
+        <w:rPr>
+          <w:rFonts w:ascii="Times New Roman" w:hAnsi="Times New Roman"/>
+          <w:b/>
+          <w:i/>
+          <w:sz w:val="28"/>
+        </w:rPr>
+        <w:t>Trong đó:</w:t>
+      </w:r>
+    </w:p>
+    <w:p>
+      <w:pPr>
+        <w:spacing w:after="120"/>
+        <w:rPr>
+          <w:rFonts w:ascii="Times New Roman" w:hAnsi="Times New Roman"/>
+          <w:sz w:val="28"/>
+        </w:rPr>
+      </w:pPr>
+      <w:r>
+        <w:rPr>
+          <w:rFonts w:ascii="Times New Roman" w:hAnsi="Times New Roman"/>
+          <w:b/>
+          <w:i/>
+          <w:sz w:val="28"/>
+        </w:rPr>
+        <w:tab/>
+      </w:r>
+      <w:r>
+        <w:rPr>
+          <w:rFonts w:ascii="Times New Roman" w:hAnsi="Times New Roman"/>
+          <w:sz w:val="28"/>
+        </w:rPr>
+        <w:t>{{land_items}}</w:t>
+      </w:r>
+    </w:p>
+    <w:p>
+      <w:pPr>
+        <w:spacing w:after="120"/>
+        <w:rPr>
+          <w:rFonts w:ascii="Times New Roman" w:hAnsi="Times New Roman"/>
+          <w:sz w:val="28"/>
+        </w:rPr>
+      </w:pPr>
+      <w:r>
+        <w:rPr>
+          <w:rFonts w:ascii="Times New Roman" w:hAnsi="Times New Roman"/>
+          <w:sz w:val="28"/>
+        </w:rPr>
+        <w:tab/>
+        <w:t>+ Nhà ở: {{dienTichTS}}; được định giá: 0 đồng.</w:t>
+      </w:r>
+    </w:p>
+    <w:p>
+      <w:pPr>
+        <w:spacing w:after="120"/>
+        <w:rPr>
+          <w:rFonts w:ascii="Times New Roman" w:hAnsi="Times New Roman"/>
+          <w:sz w:val="28"/>
+        </w:rPr>
+      </w:pPr>
+      <w:r>
+        <w:rPr>
+          <w:rFonts w:ascii="Times New Roman" w:hAnsi="Times New Roman"/>
+          <w:sz w:val="28"/>
+        </w:rPr>
+        <w:t xml:space="preserve">           </w:t>
+      </w:r>
+      <w:r>
+        <w:rPr>
+          <w:rFonts w:ascii="Times New Roman" w:hAnsi="Times New Roman"/>
+          <w:sz w:val="28"/>
+        </w:rPr>
+        <w:t xml:space="preserve">Tài sản </w:t>
+      </w:r>
+      <w:r>
+        <w:rPr>
+          <w:rFonts w:ascii="Times New Roman" w:hAnsi="Times New Roman"/>
+          <w:sz w:val="28"/>
+        </w:rPr>
+        <w:t>khác: …………………………………………………………………</w:t>
+      </w:r>
+    </w:p>
+    <w:p>
+      <w:pPr>
+        <w:spacing w:after="120"/>
+        <w:rPr>
+          <w:rFonts w:ascii="Times New Roman" w:hAnsi="Times New Roman"/>
+          <w:b/>
+          <w:sz w:val="28"/>
+        </w:rPr>
+      </w:pPr>
+      <w:r>
+        <w:rPr>
+          <w:rFonts w:ascii="Times New Roman" w:hAnsi="Times New Roman"/>
+          <w:b/>
+          <w:sz w:val="28"/>
+        </w:rPr>
+        <w:t>Tổng giá trị tài sản thế chấp được định giá là: {{tsbds}} đồng.</w:t>
+      </w:r>
+    </w:p>
+    <w:p>
+      <w:pPr>
+        <w:spacing w:after="120"/>
+        <w:rPr>
+          <w:rFonts w:ascii="Times New Roman" w:hAnsi="Times New Roman"/>
+          <w:sz w:val="28"/>
+        </w:rPr>
+      </w:pPr>
+      <w:r>
+        <w:rPr>
+          <w:rFonts w:ascii="Times New Roman" w:hAnsi="Times New Roman"/>
+          <w:b/>
+          <w:sz w:val="28"/>
+        </w:rPr>
+        <w:t xml:space="preserve">                                                                </w:t>
+      </w:r>
+      <w:r>
+        <w:rPr>
+          <w:rFonts w:ascii="Times New Roman" w:hAnsi="Times New Roman"/>
+          <w:sz w:val="28"/>
+        </w:rPr>
+        <w:t>(Ghi bằng chữ: {{tsbdc}})</w:t>
+      </w:r>
+    </w:p>
+    <w:p>
+      <w:pPr>
+        <w:rPr>
+          <w:rFonts w:ascii="Times New Roman" w:hAnsi="Times New Roman"/>
+          <w:b/>
+          <w:sz w:val="28"/>
+        </w:rPr>
+      </w:pPr>
+      <w:r>
+        <w:rPr>
+          <w:rFonts w:ascii="Times New Roman" w:hAnsi="Times New Roman"/>
+          <w:b/>
+          <w:sz w:val="28"/>
+        </w:rPr>
         <w:lastRenderedPageBreak/>
-        <w:t>- Tổng nhu cầu vốn lưu động của phương án: {{tongVonLu</w:t>
-      </w:r>
-      <w:r>
-        <w:rPr>
-          <w:rFonts w:ascii="Times New Roman" w:hAnsi="Times New Roman"/>
-          <w:sz w:val="28"/>
-        </w:rPr>
-        <w:t>u</w:t>
-      </w:r>
-      <w:r>
-        <w:rPr>
-          <w:rFonts w:ascii="Times New Roman" w:hAnsi="Times New Roman"/>
-          <w:sz w:val="28"/>
-        </w:rPr>
-        <w:t>Dong}}</w:t>
-      </w:r>
-      <w:r>
-        <w:rPr>
-          <w:rFonts w:ascii="Times New Roman" w:hAnsi="Times New Roman"/>
-          <w:sz w:val="28"/>
-        </w:rPr>
-        <w:t xml:space="preserve"> đồng</w:t>
-      </w:r>
-      <w:r>
-        <w:rPr>
-          <w:rFonts w:ascii="Times New Roman" w:hAnsi="Times New Roman"/>
-          <w:sz w:val="28"/>
-        </w:rPr>
-        <w:t>.</w:t>
-      </w:r>
-    </w:p>
-    <w:p>
-      <w:pPr>
-        <w:ind w:left="360"/>
-        <w:rPr>
-          <w:rFonts w:ascii="Times New Roman" w:hAnsi="Times New Roman"/>
-          <w:sz w:val="28"/>
-        </w:rPr>
-      </w:pPr>
-      <w:r>
-        <w:rPr>
-          <w:rFonts w:ascii="Times New Roman" w:hAnsi="Times New Roman"/>
-          <w:sz w:val="28"/>
-        </w:rPr>
-        <w:t>(Vốn lưu động của phương án = Tổng chi phí của phương án – Chi phí gián tiếp).</w:t>
-      </w:r>
-    </w:p>
-    <w:p>
-      <w:pPr>
-        <w:ind w:left="360"/>
-        <w:rPr>
-          <w:rFonts w:ascii="Times New Roman" w:hAnsi="Times New Roman"/>
-          <w:sz w:val="28"/>
-        </w:rPr>
-      </w:pPr>
-      <w:r>
-        <w:rPr>
-          <w:rFonts w:ascii="Times New Roman" w:hAnsi="Times New Roman"/>
-          <w:sz w:val="28"/>
-        </w:rPr>
-        <w:t>{{vongQuay}}</w:t>
-      </w:r>
-    </w:p>
-    <w:p>
-      <w:pPr>
-        <w:ind w:left="360"/>
-        <w:rPr>
-          <w:rFonts w:ascii="Times New Roman" w:hAnsi="Times New Roman"/>
-          <w:sz w:val="28"/>
-        </w:rPr>
-      </w:pPr>
-      <w:r>
-        <w:rPr>
-          <w:rFonts w:ascii="Times New Roman" w:hAnsi="Times New Roman"/>
-          <w:sz w:val="28"/>
-        </w:rPr>
-        <w:t>{{vonLuuDong</w:t>
-      </w:r>
-      <w:r>
-        <w:rPr>
-          <w:rFonts w:ascii="Times New Roman" w:hAnsi="Times New Roman"/>
-          <w:sz w:val="28"/>
-        </w:rPr>
-        <w:t>MotVongQuay}}</w:t>
-      </w:r>
-    </w:p>
-    <w:p>
-      <w:pPr>
-        <w:ind w:left="360"/>
-        <w:rPr>
-          <w:rFonts w:ascii="Times New Roman" w:hAnsi="Times New Roman"/>
-          <w:sz w:val="28"/>
-        </w:rPr>
-      </w:pPr>
-      <w:r>
-        <w:rPr>
-          <w:rFonts w:ascii="Times New Roman" w:hAnsi="Times New Roman"/>
-          <w:sz w:val="28"/>
-        </w:rPr>
-        <w:t>- Vốn tự có lũy kế:               {{vonTuCo}}               {{vonTuCoPercent}}.</w:t>
-      </w:r>
-    </w:p>
-    <w:p>
-      <w:pPr>
-        <w:ind w:left="360"/>
-        <w:rPr>
-          <w:rFonts w:ascii="Times New Roman" w:hAnsi="Times New Roman"/>
-          <w:sz w:val="28"/>
-        </w:rPr>
-      </w:pPr>
-      <w:r>
-        <w:rPr>
-          <w:rFonts w:ascii="Times New Roman" w:hAnsi="Times New Roman"/>
-          <w:sz w:val="28"/>
-        </w:rPr>
-        <w:t>- Vốn khác:                          {{vonKhac}}.               {{vonKhacPercent}}.</w:t>
-      </w:r>
-    </w:p>
-    <w:p>
-      <w:pPr>
-        <w:ind w:left="360"/>
-        <w:rPr>
-          <w:rFonts w:ascii="Times New Roman" w:hAnsi="Times New Roman"/>
-          <w:sz w:val="28"/>
-        </w:rPr>
-      </w:pPr>
-      <w:r>
-        <w:rPr>
-          <w:rFonts w:ascii="Times New Roman" w:hAnsi="Times New Roman"/>
-          <w:sz w:val="28"/>
-        </w:rPr>
-        <w:t>- Vốn vay quỹ tín dụng:       {{tienso}}               {{tienSoPercent}}.</w:t>
-      </w:r>
-    </w:p>
-    <w:p>
-      <w:pPr>
-        <w:rPr>
-          <w:rFonts w:ascii="Times New Roman" w:hAnsi="Times New Roman"/>
-          <w:b/>
-          <w:sz w:val="28"/>
-        </w:rPr>
-      </w:pPr>
-      <w:r>
-        <w:rPr>
-          <w:rFonts w:ascii="Times New Roman" w:hAnsi="Times New Roman"/>
-          <w:b/>
-          <w:sz w:val="28"/>
-        </w:rPr>
-        <w:t xml:space="preserve">8. Tài sản đảm bảo: </w:t>
-      </w:r>
-    </w:p>
-    <w:p>
-      <w:pPr>
-        <w:rPr>
-          <w:rFonts w:ascii="Times New Roman" w:hAnsi="Times New Roman"/>
-          <w:sz w:val="28"/>
-        </w:rPr>
-      </w:pPr>
-      <w:r>
-        <w:rPr>
-          <w:rFonts w:ascii="Times New Roman" w:hAnsi="Times New Roman"/>
-          <w:sz w:val="28"/>
-        </w:rPr>
-        <w:t xml:space="preserve">Giấy chứng nhận Quyền sử dụng đất số: </w:t>
-      </w:r>
-      <w:r>
-        <w:rPr>
-          <w:rFonts w:ascii="Times New Roman" w:hAnsi="Times New Roman"/>
-          <w:sz w:val="28"/>
-        </w:rPr>
-        <w:tab/>
-      </w:r>
-      <w:r>
-        <w:rPr>
-          <w:rFonts w:ascii="Times New Roman" w:hAnsi="Times New Roman"/>
-          <w:sz w:val="28"/>
-        </w:rPr>
-        <w:tab/>
-        <w:t>{{seri}}.</w:t>
-      </w:r>
-    </w:p>
-    <w:p>
-      <w:pPr>
-        <w:rPr>
-          <w:rFonts w:ascii="Times New Roman" w:hAnsi="Times New Roman"/>
-          <w:sz w:val="28"/>
-        </w:rPr>
-      </w:pPr>
-      <w:r>
-        <w:rPr>
-          <w:rFonts w:ascii="Times New Roman" w:hAnsi="Times New Roman"/>
-          <w:sz w:val="28"/>
-        </w:rPr>
-        <w:t xml:space="preserve">Mang tên: </w:t>
-      </w:r>
-      <w:r>
-        <w:rPr>
-          <w:rFonts w:ascii="Times New Roman" w:hAnsi="Times New Roman"/>
-          <w:sz w:val="28"/>
-        </w:rPr>
-        <w:t>{{ndtbd}}.</w:t>
-      </w:r>
-    </w:p>
-    <w:p>
-      <w:pPr>
-        <w:rPr>
-          <w:rFonts w:ascii="Times New Roman" w:hAnsi="Times New Roman"/>
-          <w:sz w:val="28"/>
-        </w:rPr>
-      </w:pPr>
-      <w:r>
-        <w:rPr>
-          <w:rFonts w:ascii="Times New Roman" w:hAnsi="Times New Roman"/>
-          <w:sz w:val="28"/>
-        </w:rPr>
-        <w:t>Số thử</w:t>
-      </w:r>
-      <w:r>
-        <w:rPr>
-          <w:rFonts w:ascii="Times New Roman" w:hAnsi="Times New Roman"/>
-          <w:sz w:val="28"/>
-        </w:rPr>
-        <w:t xml:space="preserve">a: {{std}}.                                        </w:t>
-      </w:r>
-      <w:r>
-        <w:rPr>
-          <w:rFonts w:ascii="Times New Roman" w:hAnsi="Times New Roman"/>
-          <w:sz w:val="28"/>
-        </w:rPr>
-        <w:t>Tờ bản đồ: {{sbd}}.</w:t>
-      </w:r>
-    </w:p>
-    <w:p>
-      <w:pPr>
-        <w:rPr>
-          <w:rFonts w:ascii="Times New Roman" w:hAnsi="Times New Roman"/>
-          <w:sz w:val="28"/>
-        </w:rPr>
-      </w:pPr>
-      <w:r>
-        <w:rPr>
-          <w:rFonts w:ascii="Times New Roman" w:hAnsi="Times New Roman"/>
-          <w:sz w:val="28"/>
-        </w:rPr>
-        <w:t>Vào sổ cấp Giấy chứng nhận số: {{vsmt}}.</w:t>
-      </w:r>
-    </w:p>
-    <w:p>
-      <w:pPr>
-        <w:rPr>
-          <w:rFonts w:ascii="Times New Roman" w:hAnsi="Times New Roman"/>
-          <w:sz w:val="28"/>
-        </w:rPr>
-      </w:pPr>
-      <w:r>
-        <w:rPr>
-          <w:rFonts w:ascii="Times New Roman" w:hAnsi="Times New Roman"/>
-          <w:sz w:val="28"/>
-        </w:rPr>
-        <w:t xml:space="preserve">Do: </w:t>
-      </w:r>
-      <w:r>
-        <w:rPr>
-          <w:rFonts w:ascii="Times New Roman" w:hAnsi="Times New Roman"/>
-          <w:sz w:val="28"/>
-        </w:rPr>
-        <w:t xml:space="preserve">{{dctd}} </w:t>
-      </w:r>
-      <w:r>
-        <w:rPr>
-          <w:rFonts w:ascii="Times New Roman" w:hAnsi="Times New Roman"/>
-          <w:sz w:val="28"/>
-        </w:rPr>
-        <w:t xml:space="preserve">            </w:t>
-      </w:r>
-      <w:r>
-        <w:rPr>
-          <w:rFonts w:ascii="Times New Roman" w:hAnsi="Times New Roman"/>
-          <w:sz w:val="28"/>
-        </w:rPr>
-        <w:t>cấp ngày: {{ngc}}.</w:t>
-      </w:r>
-    </w:p>
-    <w:p>
-      <w:pPr>
-        <w:rPr>
-          <w:rFonts w:ascii="Times New Roman" w:hAnsi="Times New Roman"/>
-          <w:sz w:val="28"/>
-        </w:rPr>
-      </w:pPr>
-      <w:r>
-        <w:rPr>
-          <w:rFonts w:ascii="Times New Roman" w:hAnsi="Times New Roman"/>
-          <w:sz w:val="28"/>
-        </w:rPr>
-        <w:t>Diện tích: {{dt}}.</w:t>
-      </w:r>
-    </w:p>
-    <w:p>
-      <w:pPr>
-        <w:rPr>
-          <w:rFonts w:ascii="Times New Roman" w:hAnsi="Times New Roman"/>
-          <w:b/>
-          <w:i/>
-          <w:sz w:val="28"/>
-        </w:rPr>
-      </w:pPr>
-      <w:r>
-        <w:rPr>
-          <w:rFonts w:ascii="Times New Roman" w:hAnsi="Times New Roman"/>
-          <w:b/>
-          <w:i/>
-          <w:sz w:val="28"/>
-        </w:rPr>
-        <w:t>Trong đó:</w:t>
-      </w:r>
-    </w:p>
-    <w:p>
-      <w:pPr>
-        <w:spacing w:after="120"/>
-        <w:rPr>
-          <w:rFonts w:ascii="Times New Roman" w:hAnsi="Times New Roman"/>
-          <w:sz w:val="28"/>
-        </w:rPr>
-      </w:pPr>
-      <w:r>
-        <w:rPr>
-          <w:rFonts w:ascii="Times New Roman" w:hAnsi="Times New Roman"/>
-          <w:b/>
-          <w:i/>
-          <w:sz w:val="28"/>
-        </w:rPr>
-        <w:tab/>
-      </w:r>
-      <w:r>
-        <w:rPr>
-          <w:rFonts w:ascii="Times New Roman" w:hAnsi="Times New Roman"/>
-          <w:sz w:val="28"/>
-        </w:rPr>
-        <w:t>{{land_items}}</w:t>
-      </w:r>
-    </w:p>
-    <w:p>
-      <w:pPr>
-        <w:spacing w:after="120"/>
-        <w:rPr>
-          <w:rFonts w:ascii="Times New Roman" w:hAnsi="Times New Roman"/>
-          <w:sz w:val="28"/>
-        </w:rPr>
-      </w:pPr>
-      <w:r>
-        <w:rPr>
-          <w:rFonts w:ascii="Times New Roman" w:hAnsi="Times New Roman"/>
-          <w:sz w:val="28"/>
-        </w:rPr>
-        <w:tab/>
-        <w:t>+ Nhà ở: {{dienTichTS}}; được định giá: 0 đồng.</w:t>
-      </w:r>
-    </w:p>
-    <w:p>
-      <w:pPr>
-        <w:spacing w:after="120"/>
-        <w:rPr>
-          <w:rFonts w:ascii="Times New Roman" w:hAnsi="Times New Roman"/>
-          <w:sz w:val="28"/>
-        </w:rPr>
-      </w:pPr>
-      <w:r>
-        <w:rPr>
-          <w:rFonts w:ascii="Times New Roman" w:hAnsi="Times New Roman"/>
-          <w:sz w:val="28"/>
-        </w:rPr>
-        <w:t xml:space="preserve">           </w:t>
-      </w:r>
-      <w:r>
-        <w:rPr>
-          <w:rFonts w:ascii="Times New Roman" w:hAnsi="Times New Roman"/>
-          <w:sz w:val="28"/>
-        </w:rPr>
-        <w:t xml:space="preserve">Tài sản </w:t>
-      </w:r>
-      <w:r>
-        <w:rPr>
-          <w:rFonts w:ascii="Times New Roman" w:hAnsi="Times New Roman"/>
-          <w:sz w:val="28"/>
-        </w:rPr>
-        <w:t>khác: …………………………………………………………………</w:t>
-      </w:r>
-    </w:p>
-    <w:p>
-      <w:pPr>
-        <w:spacing w:after="120"/>
-        <w:rPr>
-          <w:rFonts w:ascii="Times New Roman" w:hAnsi="Times New Roman"/>
-          <w:b/>
-          <w:sz w:val="28"/>
-        </w:rPr>
-      </w:pPr>
-      <w:r>
-        <w:rPr>
-          <w:rFonts w:ascii="Times New Roman" w:hAnsi="Times New Roman"/>
-          <w:b/>
-          <w:sz w:val="28"/>
-        </w:rPr>
-        <w:t>Tổng giá trị tài sản thế chấp được định giá là: {{tsbds}} đồng.</w:t>
-      </w:r>
-    </w:p>
-    <w:p>
-      <w:pPr>
-        <w:spacing w:after="120"/>
-        <w:rPr>
-          <w:rFonts w:ascii="Times New Roman" w:hAnsi="Times New Roman"/>
-          <w:sz w:val="28"/>
-        </w:rPr>
-      </w:pPr>
-      <w:r>
-        <w:rPr>
-          <w:rFonts w:ascii="Times New Roman" w:hAnsi="Times New Roman"/>
-          <w:b/>
-          <w:sz w:val="28"/>
-        </w:rPr>
-        <w:t xml:space="preserve">                                                                </w:t>
-      </w:r>
-      <w:r>
-        <w:rPr>
-          <w:rFonts w:ascii="Times New Roman" w:hAnsi="Times New Roman"/>
-          <w:sz w:val="28"/>
-        </w:rPr>
-        <w:t>(Ghi bằng chữ: {{tsbdc}})</w:t>
-      </w:r>
-    </w:p>
-    <w:p>
-      <w:pPr>
-        <w:rPr>
-          <w:rFonts w:ascii="Times New Roman" w:hAnsi="Times New Roman"/>
-          <w:b/>
-          <w:sz w:val="28"/>
-        </w:rPr>
-      </w:pPr>
-      <w:r>
-        <w:rPr>
-          <w:rFonts w:ascii="Times New Roman" w:hAnsi="Times New Roman"/>
-          <w:b/>
-          <w:sz w:val="28"/>
-        </w:rPr>
         <w:t>9. Cam kết:</w:t>
       </w:r>
     </w:p>
@@ -1084,15 +1261,7 @@
           <w:sz w:val="28"/>
         </w:rPr>
         <w:tab/>
-        <w:t xml:space="preserve">Tôi là: {{kh}} cam kết cung cấp thông tin, hồ sơ đúng sự thật và chịu trách nhiệm tính chính xác các nội dung đã được cung cấp. Nếu được QTD cho vay vốn </w:t>
-      </w:r>
-      <w:r>
-        <w:rPr>
-          <w:rFonts w:ascii="Times New Roman" w:hAnsi="Times New Roman"/>
-          <w:sz w:val="28"/>
-        </w:rPr>
-        <w:lastRenderedPageBreak/>
-        <w:t>gia đình tôi cam kết sử dụng vốn đúng mục đích, trả nợ gốc, lãi đúng kỳ hạn ghi trên hợp đồng cho vay.</w:t>
+        <w:t>Tôi là: {{kh}} cam kết cung cấp thông tin, hồ sơ đúng sự thật và chịu trách nhiệm tính chính xác các nội dung đã được cung cấp. Nếu được QTD cho vay vốn gia đình tôi cam kết sử dụng vốn đúng mục đích, trả nợ gốc, lãi đúng kỳ hạn ghi trên hợp đồng cho vay.</w:t>
       </w:r>
     </w:p>
     <w:p>

</xml_diff>